<commit_message>
feat(template): rebuild course_template.docx with full SoW visual identity
- SoW styles merged via lxml (Arial 11pt, heading palette H1-H6, Title/Subtitle)
- SoW header: A! logo (Arial Black), course name, live-doc hyperlink placeholder, rule
- Page number footer (centred, grey)
- A4 portrait, 1-inch margins, embedded Arial Black TTF
- Delete reference_base.docx (unused; course_template.docx is the reference doc)

Co-Authored-By: Claude Sonnet 4.6 <noreply@anthropic.com>
</commit_message>
<xml_diff>
--- a/templates/course_template.docx
+++ b/templates/course_template.docx
@@ -381,9 +381,13 @@
       </w:r>
     </w:p>
     <w:sectPr>
+      <w:headerReference w:type="default" r:id="rId_hdr1"/>
+      <w:footerReference w:type="default" r:id="rId_ftr1"/>
       <w:footnotePr>
         <w:numRestart w:val="eachSect"/>
       </w:footnotePr>
+      <w:pgSz w:w="11909" w:h="16834" w:orient="portrait"/>
+      <w:pgMar w:top="1440" w:right="1440" w:bottom="1440" w:left="1440" w:header="720" w:footer="720"/>
     </w:sectPr>
   </w:body>
 </w:document>
@@ -393,6 +397,27 @@
 <w:comments xmlns:w="http://schemas.openxmlformats.org/wordprocessingml/2006/main" xmlns:m="http://schemas.openxmlformats.org/officeDocument/2006/math" xmlns:r="http://schemas.openxmlformats.org/officeDocument/2006/relationships" xmlns:o="urn:schemas-microsoft-com:office:office" xmlns:v="urn:schemas-microsoft-com:vml" xmlns:w10="urn:schemas-microsoft-com:office:word" xmlns:a="http://schemas.openxmlformats.org/drawingml/2006/main" xmlns:pic="http://schemas.openxmlformats.org/drawingml/2006/picture" xmlns:wp="http://schemas.openxmlformats.org/drawingml/2006/wordprocessingDrawing"/>
 </file>
 
+<file path=word/footer1.xml><?xml version="1.0" encoding="utf-8"?>
+<w:ftr xmlns:w="http://schemas.openxmlformats.org/wordprocessingml/2006/main" xmlns:r="http://schemas.openxmlformats.org/officeDocument/2006/relationships">
+  <w:p>
+    <w:pPr>
+      <w:jc w:val="center"/>
+      <w:rPr>
+        <w:color w:val="666666"/>
+      </w:rPr>
+    </w:pPr>
+    <w:fldSimple w:instr=" PAGE \* MERGEFORMAT ">
+      <w:r>
+        <w:rPr>
+          <w:color w:val="666666"/>
+        </w:rPr>
+        <w:t>1</w:t>
+      </w:r>
+    </w:fldSimple>
+  </w:p>
+</w:ftr>
+</file>
+
 <file path=word/footnotes.xml><?xml version="1.0" encoding="utf-8"?>
 <w:footnotes xmlns:w="http://schemas.openxmlformats.org/wordprocessingml/2006/main" xmlns:m="http://schemas.openxmlformats.org/officeDocument/2006/math" xmlns:r="http://schemas.openxmlformats.org/officeDocument/2006/relationships" xmlns:o="urn:schemas-microsoft-com:office:office" xmlns:v="urn:schemas-microsoft-com:vml" xmlns:w10="urn:schemas-microsoft-com:office:word" xmlns:a="http://schemas.openxmlformats.org/drawingml/2006/main" xmlns:pic="http://schemas.openxmlformats.org/drawingml/2006/picture" xmlns:wp="http://schemas.openxmlformats.org/drawingml/2006/wordprocessingDrawing">
   <w:footnote w:type="continuationSeparator" w:id="0">
@@ -429,6 +454,82 @@
     </w:p>
   </w:footnote>
 </w:footnotes>
+</file>
+
+<file path=word/header1.xml><?xml version="1.0" encoding="utf-8"?>
+<w:hdr xmlns:mc="http://schemas.openxmlformats.org/markup-compatibility/2006" xmlns:o="urn:schemas-microsoft-com:office:office" xmlns:r="http://schemas.openxmlformats.org/officeDocument/2006/relationships" xmlns:m="http://schemas.openxmlformats.org/officeDocument/2006/math" xmlns:v="urn:schemas-microsoft-com:vml" xmlns:wp="http://schemas.openxmlformats.org/drawingml/2006/wordprocessingDrawing" xmlns:w10="urn:schemas-microsoft-com:office:word" xmlns:w="http://schemas.openxmlformats.org/wordprocessingml/2006/main" xmlns:wne="http://schemas.microsoft.com/office/word/2006/wordml" xmlns:sl="http://schemas.openxmlformats.org/schemaLibrary/2006/main" xmlns:a="http://schemas.openxmlformats.org/drawingml/2006/main" xmlns:pic="http://schemas.openxmlformats.org/drawingml/2006/picture" xmlns:c="http://schemas.openxmlformats.org/drawingml/2006/chart" xmlns:lc="http://schemas.openxmlformats.org/drawingml/2006/lockedCanvas" xmlns:dgm="http://schemas.openxmlformats.org/drawingml/2006/diagram" xmlns:wps="http://schemas.microsoft.com/office/word/2010/wordprocessingShape" xmlns:wpg="http://schemas.microsoft.com/office/word/2010/wordprocessingGroup" xmlns:w14="http://schemas.microsoft.com/office/word/2010/wordml" xmlns:w15="http://schemas.microsoft.com/office/word/2012/wordml" xmlns:w16="http://schemas.microsoft.com/office/word/2018/wordml" xmlns:w16cex="http://schemas.microsoft.com/office/word/2018/wordml/cex" xmlns:w16cid="http://schemas.microsoft.com/office/word/2016/wordml/cid" xmlns="http://schemas.microsoft.com/office/tasks/2019/documenttasks" xmlns:cr="http://schemas.microsoft.com/office/comments/2020/reactions">
+  <w:p>
+    <w:pPr>
+      <w:rPr>
+        <w:color w:val="666666"/>
+      </w:rPr>
+    </w:pPr>
+    <w:r>
+      <w:rPr>
+        <w:rFonts w:ascii="Arial Black" w:cs="Arial Black" w:eastAsia="Arial Black" w:hAnsi="Arial Black"/>
+        <w:sz w:val="40"/>
+        <w:szCs w:val="40"/>
+        <w:rtl w:val="0"/>
+      </w:rPr>
+      <w:t xml:space="preserve">A</w:t>
+    </w:r>
+    <w:r>
+      <w:rPr>
+        <w:rFonts w:ascii="Arial Black" w:cs="Arial Black" w:eastAsia="Arial Black" w:hAnsi="Arial Black"/>
+        <w:color w:val="ff0000"/>
+        <w:sz w:val="40"/>
+        <w:szCs w:val="40"/>
+        <w:rtl w:val="0"/>
+      </w:rPr>
+      <w:t xml:space="preserve">!</w:t>
+      <w:tab/>
+    </w:r>
+    <w:r>
+      <w:rPr>
+        <w:color w:val="666666"/>
+        <w:rtl w:val="0"/>
+      </w:rPr>
+      <w:t xml:space="preserve">ELEC-E4240 Satellite Systems 2026   </w:t>
+      <w:tab/>
+      <w:tab/>
+    </w:r>
+    <w:hyperlink r:id="rId1">
+      <w:r>
+        <w:rPr>
+          <w:color w:val="1155cc"/>
+          <w:u w:val="single"/>
+          <w:rtl w:val="0"/>
+        </w:rPr>
+        <w:t xml:space="preserve">Link to your live document</w:t>
+      </w:r>
+    </w:hyperlink>
+    <w:r>
+      <w:rPr>
+        <w:rtl w:val="0"/>
+      </w:rPr>
+    </w:r>
+  </w:p>
+  <w:p>
+    <w:pPr>
+      <w:rPr>
+        <w:rFonts w:ascii="Arial Black" w:cs="Arial Black" w:eastAsia="Arial Black" w:hAnsi="Arial Black"/>
+        <w:color w:val="ff0000"/>
+        <w:sz w:val="40"/>
+        <w:szCs w:val="40"/>
+      </w:rPr>
+    </w:pPr>
+    <w:r>
+      <w:pict>
+        <v:rect style="width:0.0pt;height:1.5pt" o:hr="t" o:hrstd="t" o:hralign="center" fillcolor="#A0A0A0" stroked="f"/>
+      </w:pict>
+    </w:r>
+    <w:r>
+      <w:rPr>
+        <w:rtl w:val="0"/>
+      </w:rPr>
+    </w:r>
+  </w:p>
+</w:hdr>
 </file>
 
 <file path=word/numbering.xml><?xml version="1.0" encoding="utf-8"?>
@@ -543,26 +644,209 @@
 </file>
 
 <file path=word/styles.xml><?xml version="1.0" encoding="utf-8"?>
-<w:styles xmlns:r="http://schemas.openxmlformats.org/officeDocument/2006/relationships" xmlns:w="http://schemas.openxmlformats.org/wordprocessingml/2006/main">
+<w:styles xmlns:mc="http://schemas.openxmlformats.org/markup-compatibility/2006" xmlns:o="urn:schemas-microsoft-com:office:office" xmlns:r="http://schemas.openxmlformats.org/officeDocument/2006/relationships" xmlns:m="http://schemas.openxmlformats.org/officeDocument/2006/math" xmlns:v="urn:schemas-microsoft-com:vml" xmlns:wp="http://schemas.openxmlformats.org/drawingml/2006/wordprocessingDrawing" xmlns:w10="urn:schemas-microsoft-com:office:word" xmlns:w="http://schemas.openxmlformats.org/wordprocessingml/2006/main" xmlns:wne="http://schemas.microsoft.com/office/word/2006/wordml" xmlns:sl="http://schemas.openxmlformats.org/schemaLibrary/2006/main" xmlns:a="http://schemas.openxmlformats.org/drawingml/2006/main" xmlns:pic="http://schemas.openxmlformats.org/drawingml/2006/picture" xmlns:c="http://schemas.openxmlformats.org/drawingml/2006/chart" xmlns:lc="http://schemas.openxmlformats.org/drawingml/2006/lockedCanvas" xmlns:dgm="http://schemas.openxmlformats.org/drawingml/2006/diagram" xmlns:wps="http://schemas.microsoft.com/office/word/2010/wordprocessingShape" xmlns:wpg="http://schemas.microsoft.com/office/word/2010/wordprocessingGroup" xmlns:w14="http://schemas.microsoft.com/office/word/2010/wordml" xmlns:w15="http://schemas.microsoft.com/office/word/2012/wordml" xmlns:w16="http://schemas.microsoft.com/office/word/2018/wordml" xmlns:w16cex="http://schemas.microsoft.com/office/word/2018/wordml/cex" xmlns:w16cid="http://schemas.microsoft.com/office/word/2016/wordml/cid" xmlns="http://schemas.microsoft.com/office/tasks/2019/documenttasks" xmlns:cr="http://schemas.microsoft.com/office/comments/2020/reactions">
   <w:docDefaults>
     <w:rPrDefault>
       <w:rPr>
-        <w:rFonts w:asciiTheme="minorHAnsi" w:eastAsiaTheme="minorHAnsi" w:hAnsiTheme="minorHAnsi" w:cstheme="minorBidi"/>
-        <w:sz w:val="24"/>
-        <w:szCs w:val="24"/>
-        <w:lang w:val="en-US" w:eastAsia="en-US" w:bidi="ar-SA"/>
+        <w:rFonts w:ascii="Arial" w:cs="Arial" w:eastAsia="Arial" w:hAnsi="Arial"/>
+        <w:sz w:val="22"/>
+        <w:szCs w:val="22"/>
+        <w:lang w:val="en_GB"/>
       </w:rPr>
     </w:rPrDefault>
     <w:pPrDefault>
       <w:pPr>
-        <w:spacing w:after="200"/>
+        <w:spacing w:line="276" w:lineRule="auto"/>
       </w:pPr>
     </w:pPrDefault>
   </w:docDefaults>
-  <w:latentStyles w:defLockedState="0" w:defUIPriority="0" w:defSemiHidden="0" w:defUnhideWhenUsed="0" w:defQFormat="0" w:count="276"/>
-  <w:style w:type="paragraph" w:default="1" w:styleId="Normal">
-    <w:name w:val="Normal"/>
-    <w:qFormat/>
+  <w:style w:type="table" w:styleId="TableNormal" w:default="1">
+    <w:name w:val="TableNormal"/>
+    <w:tblPr>
+      <w:tblCellMar>
+        <w:top w:w="100.0" w:type="dxa"/>
+        <w:left w:w="100.0" w:type="dxa"/>
+        <w:bottom w:w="100.0" w:type="dxa"/>
+        <w:right w:w="100.0" w:type="dxa"/>
+      </w:tblCellMar>
+    </w:tblPr>
+  </w:style>
+  <w:style w:type="paragraph" w:styleId="Normal" w:default="1">
+    <w:name w:val="normal"/>
+  </w:style>
+  <w:style w:type="paragraph" w:styleId="Heading1">
+    <w:name w:val="heading 1"/>
+    <w:basedOn w:val="Normal"/>
+    <w:next w:val="Normal"/>
+    <w:pPr>
+      <w:keepNext w:val="1"/>
+      <w:keepLines w:val="1"/>
+      <w:pageBreakBefore w:val="0"/>
+      <w:spacing w:after="120" w:before="400" w:lineRule="auto"/>
+    </w:pPr>
+    <w:rPr>
+      <w:sz w:val="40"/>
+      <w:szCs w:val="40"/>
+    </w:rPr>
+  </w:style>
+  <w:style w:type="paragraph" w:styleId="Heading2">
+    <w:name w:val="heading 2"/>
+    <w:basedOn w:val="Normal"/>
+    <w:next w:val="Normal"/>
+    <w:pPr>
+      <w:keepNext w:val="1"/>
+      <w:keepLines w:val="1"/>
+      <w:pageBreakBefore w:val="0"/>
+      <w:spacing w:after="120" w:before="360" w:lineRule="auto"/>
+    </w:pPr>
+    <w:rPr>
+      <w:b w:val="0"/>
+      <w:bCs w:val="0"/>
+      <w:sz w:val="32"/>
+      <w:szCs w:val="32"/>
+    </w:rPr>
+  </w:style>
+  <w:style w:type="paragraph" w:styleId="Heading3">
+    <w:name w:val="heading 3"/>
+    <w:basedOn w:val="Normal"/>
+    <w:next w:val="Normal"/>
+    <w:pPr>
+      <w:keepNext w:val="1"/>
+      <w:keepLines w:val="1"/>
+      <w:pageBreakBefore w:val="0"/>
+      <w:spacing w:after="80" w:before="320" w:lineRule="auto"/>
+    </w:pPr>
+    <w:rPr>
+      <w:b w:val="0"/>
+      <w:bCs w:val="0"/>
+      <w:color w:val="434343"/>
+      <w:sz w:val="28"/>
+      <w:szCs w:val="28"/>
+    </w:rPr>
+  </w:style>
+  <w:style w:type="paragraph" w:styleId="Heading4">
+    <w:name w:val="heading 4"/>
+    <w:basedOn w:val="Normal"/>
+    <w:next w:val="Normal"/>
+    <w:pPr>
+      <w:keepNext w:val="1"/>
+      <w:keepLines w:val="1"/>
+      <w:pageBreakBefore w:val="0"/>
+      <w:spacing w:after="80" w:before="280" w:lineRule="auto"/>
+    </w:pPr>
+    <w:rPr>
+      <w:color w:val="666666"/>
+      <w:sz w:val="24"/>
+      <w:szCs w:val="24"/>
+    </w:rPr>
+  </w:style>
+  <w:style w:type="paragraph" w:styleId="Heading5">
+    <w:name w:val="heading 5"/>
+    <w:basedOn w:val="Normal"/>
+    <w:next w:val="Normal"/>
+    <w:pPr>
+      <w:keepNext w:val="1"/>
+      <w:keepLines w:val="1"/>
+      <w:pageBreakBefore w:val="0"/>
+      <w:spacing w:after="80" w:before="240" w:lineRule="auto"/>
+    </w:pPr>
+    <w:rPr>
+      <w:color w:val="666666"/>
+      <w:sz w:val="22"/>
+      <w:szCs w:val="22"/>
+    </w:rPr>
+  </w:style>
+  <w:style w:type="paragraph" w:styleId="Heading6">
+    <w:name w:val="heading 6"/>
+    <w:basedOn w:val="Normal"/>
+    <w:next w:val="Normal"/>
+    <w:pPr>
+      <w:keepNext w:val="1"/>
+      <w:keepLines w:val="1"/>
+      <w:pageBreakBefore w:val="0"/>
+      <w:spacing w:after="80" w:before="240" w:lineRule="auto"/>
+    </w:pPr>
+    <w:rPr>
+      <w:i w:val="1"/>
+      <w:iCs w:val="1"/>
+      <w:color w:val="666666"/>
+      <w:sz w:val="22"/>
+      <w:szCs w:val="22"/>
+    </w:rPr>
+  </w:style>
+  <w:style w:type="paragraph" w:styleId="Title">
+    <w:name w:val="Title"/>
+    <w:basedOn w:val="Normal"/>
+    <w:next w:val="Normal"/>
+    <w:pPr>
+      <w:keepNext w:val="1"/>
+      <w:keepLines w:val="1"/>
+      <w:pageBreakBefore w:val="0"/>
+      <w:spacing w:after="60" w:before="0" w:lineRule="auto"/>
+    </w:pPr>
+    <w:rPr>
+      <w:sz w:val="52"/>
+      <w:szCs w:val="52"/>
+    </w:rPr>
+  </w:style>
+  <w:style w:type="paragraph" w:styleId="Subtitle">
+    <w:name w:val="Subtitle"/>
+    <w:basedOn w:val="Normal"/>
+    <w:next w:val="Normal"/>
+    <w:pPr>
+      <w:keepNext w:val="1"/>
+      <w:keepLines w:val="1"/>
+      <w:pageBreakBefore w:val="0"/>
+      <w:spacing w:after="320" w:before="0" w:lineRule="auto"/>
+    </w:pPr>
+    <w:rPr>
+      <w:rFonts w:ascii="Arial" w:cs="Arial" w:eastAsia="Arial" w:hAnsi="Arial"/>
+      <w:i w:val="0"/>
+      <w:iCs w:val="0"/>
+      <w:color w:val="666666"/>
+      <w:sz w:val="30"/>
+      <w:szCs w:val="30"/>
+    </w:rPr>
+  </w:style>
+  <w:style w:type="table" w:styleId="Table1">
+    <w:basedOn w:val="TableNormal"/>
+    <w:tblPr>
+      <w:tblStyleRowBandSize w:val="1"/>
+      <w:tblStyleColBandSize w:val="1"/>
+      <w:tblCellMar/>
+    </w:tblPr>
+  </w:style>
+  <w:style w:type="table" w:styleId="Table2">
+    <w:basedOn w:val="TableNormal"/>
+    <w:tblPr>
+      <w:tblStyleRowBandSize w:val="1"/>
+      <w:tblStyleColBandSize w:val="1"/>
+      <w:tblCellMar/>
+    </w:tblPr>
+  </w:style>
+  <w:style w:type="table" w:styleId="Table3">
+    <w:basedOn w:val="TableNormal"/>
+    <w:tblPr>
+      <w:tblStyleRowBandSize w:val="1"/>
+      <w:tblStyleColBandSize w:val="1"/>
+      <w:tblCellMar/>
+    </w:tblPr>
+  </w:style>
+  <w:style w:type="table" w:styleId="Table4">
+    <w:basedOn w:val="TableNormal"/>
+    <w:tblPr>
+      <w:tblStyleRowBandSize w:val="1"/>
+      <w:tblStyleColBandSize w:val="1"/>
+      <w:tblCellMar/>
+    </w:tblPr>
+  </w:style>
+  <w:style w:type="table" w:styleId="Table5">
+    <w:basedOn w:val="TableNormal"/>
+    <w:tblPr>
+      <w:tblStyleRowBandSize w:val="1"/>
+      <w:tblStyleColBandSize w:val="1"/>
+      <w:tblCellMar/>
+    </w:tblPr>
   </w:style>
   <w:style w:type="paragraph" w:styleId="BodyText">
     <w:name w:val="Body Text"/>
@@ -586,25 +870,6 @@
     <w:pPr>
       <w:spacing w:before="36" w:after="36"/>
     </w:pPr>
-  </w:style>
-  <w:style w:type="paragraph" w:styleId="Title">
-    <w:name w:val="Title"/>
-    <w:basedOn w:val="Normal"/>
-    <w:next w:val="BodyText"/>
-    <w:link w:val="TitleChar"/>
-    <w:uiPriority w:val="10"/>
-    <w:qFormat/>
-    <w:rsid w:val="00A10FD9"/>
-    <w:pPr>
-      <w:spacing w:after="80" w:line="240" w:lineRule="auto"/>
-      <w:contextualSpacing/>
-      <w:jc w:val="center"/>
-    </w:pPr>
-    <w:rPr>
-      <w:rFonts w:asciiTheme="majorHAnsi" w:eastAsiaTheme="majorEastAsia" w:hAnsiTheme="majorHAnsi" w:cstheme="majorBidi"/>
-      <w:sz w:val="56"/>
-      <w:szCs w:val="56"/>
-    </w:rPr>
   </w:style>
   <w:style w:type="character" w:customStyle="1" w:styleId="TitleChar">
     <w:name w:val="Title Char"/>
@@ -613,29 +878,9 @@
     <w:uiPriority w:val="10"/>
     <w:rsid w:val="00A10FD9"/>
     <w:rPr>
-      <w:rFonts w:asciiTheme="majorHAnsi" w:eastAsiaTheme="majorEastAsia" w:hAnsiTheme="majorHAnsi" w:cstheme="majorBidi"/>
+      <w:rFonts w:ascii="Arial" w:hAnsi="Arial" w:cs="Arial"/>
       <w:sz w:val="56"/>
       <w:szCs w:val="56"/>
-    </w:rPr>
-  </w:style>
-  <w:style w:type="paragraph" w:styleId="Subtitle">
-    <w:name w:val="Subtitle"/>
-    <w:basedOn w:val="Title"/>
-    <w:next w:val="BodyText"/>
-    <w:link w:val="SubtitleChar"/>
-    <w:uiPriority w:val="11"/>
-    <w:qFormat/>
-    <w:rsid w:val="00A10FD9"/>
-    <w:pPr>
-      <w:numPr>
-        <w:ilvl w:val="1"/>
-      </w:numPr>
-    </w:pPr>
-    <w:rPr>
-      <w:rFonts w:eastAsiaTheme="majorEastAsia" w:cstheme="majorBidi"/>
-      <w:spacing w:val="15"/>
-      <w:sz w:val="28"/>
-      <w:szCs w:val="28"/>
     </w:rPr>
   </w:style>
   <w:style w:type="character" w:customStyle="1" w:styleId="SubtitleChar">
@@ -645,7 +890,7 @@
     <w:uiPriority w:val="11"/>
     <w:rsid w:val="00A10FD9"/>
     <w:rPr>
-      <w:rFonts w:eastAsiaTheme="majorEastAsia" w:cstheme="majorBidi"/>
+      <w:rFonts w:ascii="Arial" w:hAnsi="Arial" w:cs="Arial"/>
       <w:color w:val="595959" w:themeColor="text1" w:themeTint="A6"/>
       <w:spacing w:val="15"/>
       <w:sz w:val="28"/>
@@ -719,140 +964,6 @@
     <w:qFormat/>
     <w:pPr/>
     <w:rPr/>
-  </w:style>
-  <w:style w:type="paragraph" w:styleId="Heading1">
-    <w:name w:val="heading 1"/>
-    <w:basedOn w:val="Normal"/>
-    <w:next w:val="BodyText"/>
-    <w:link w:val="Heading1Char"/>
-    <w:uiPriority w:val="9"/>
-    <w:qFormat/>
-    <w:rsid w:val="00A10FD9"/>
-    <w:rPr>
-      <w:sz w:val="40"/>
-      <w:szCs w:val="40"/>
-    </w:rPr>
-    <w:pPr>
-      <w:keepNext w:val="1"/>
-      <w:keepLines w:val="1"/>
-      <w:pageBreakBefore w:val="0"/>
-      <w:spacing w:after="120" w:before="400" w:lineRule="auto"/>
-    </w:pPr>
-  </w:style>
-  <w:style w:type="paragraph" w:styleId="Heading2">
-    <w:name w:val="heading 2"/>
-    <w:basedOn w:val="Normal"/>
-    <w:next w:val="BodyText"/>
-    <w:link w:val="Heading2Char"/>
-    <w:uiPriority w:val="9"/>
-    <w:semiHidden/>
-    <w:unhideWhenUsed/>
-    <w:qFormat/>
-    <w:rsid w:val="00A10FD9"/>
-    <w:rPr>
-      <w:b w:val="0"/>
-      <w:bCs w:val="0"/>
-      <w:sz w:val="32"/>
-      <w:szCs w:val="32"/>
-    </w:rPr>
-    <w:pPr>
-      <w:keepNext w:val="1"/>
-      <w:keepLines w:val="1"/>
-      <w:pageBreakBefore w:val="0"/>
-      <w:spacing w:after="120" w:before="360" w:lineRule="auto"/>
-    </w:pPr>
-  </w:style>
-  <w:style w:type="paragraph" w:styleId="Heading3">
-    <w:name w:val="heading 3"/>
-    <w:basedOn w:val="Normal"/>
-    <w:next w:val="BodyText"/>
-    <w:link w:val="Heading3Char"/>
-    <w:uiPriority w:val="9"/>
-    <w:semiHidden/>
-    <w:unhideWhenUsed/>
-    <w:qFormat/>
-    <w:rsid w:val="00A10FD9"/>
-    <w:rPr>
-      <w:b w:val="0"/>
-      <w:bCs w:val="0"/>
-      <w:color w:val="434343"/>
-      <w:sz w:val="28"/>
-      <w:szCs w:val="28"/>
-    </w:rPr>
-    <w:pPr>
-      <w:keepNext w:val="1"/>
-      <w:keepLines w:val="1"/>
-      <w:pageBreakBefore w:val="0"/>
-      <w:spacing w:after="80" w:before="320" w:lineRule="auto"/>
-    </w:pPr>
-  </w:style>
-  <w:style w:type="paragraph" w:styleId="Heading4">
-    <w:name w:val="heading 4"/>
-    <w:basedOn w:val="Normal"/>
-    <w:next w:val="BodyText"/>
-    <w:link w:val="Heading4Char"/>
-    <w:uiPriority w:val="9"/>
-    <w:semiHidden/>
-    <w:unhideWhenUsed/>
-    <w:qFormat/>
-    <w:rsid w:val="00A10FD9"/>
-    <w:rPr>
-      <w:color w:val="666666"/>
-      <w:sz w:val="24"/>
-      <w:szCs w:val="24"/>
-    </w:rPr>
-    <w:pPr>
-      <w:keepNext w:val="1"/>
-      <w:keepLines w:val="1"/>
-      <w:pageBreakBefore w:val="0"/>
-      <w:spacing w:after="80" w:before="280" w:lineRule="auto"/>
-    </w:pPr>
-  </w:style>
-  <w:style w:type="paragraph" w:styleId="Heading5">
-    <w:name w:val="heading 5"/>
-    <w:basedOn w:val="Normal"/>
-    <w:next w:val="BodyText"/>
-    <w:link w:val="Heading5Char"/>
-    <w:uiPriority w:val="9"/>
-    <w:semiHidden/>
-    <w:unhideWhenUsed/>
-    <w:qFormat/>
-    <w:rsid w:val="00A10FD9"/>
-    <w:rPr>
-      <w:color w:val="666666"/>
-      <w:sz w:val="22"/>
-      <w:szCs w:val="22"/>
-    </w:rPr>
-    <w:pPr>
-      <w:keepNext w:val="1"/>
-      <w:keepLines w:val="1"/>
-      <w:pageBreakBefore w:val="0"/>
-      <w:spacing w:after="80" w:before="240" w:lineRule="auto"/>
-    </w:pPr>
-  </w:style>
-  <w:style w:type="paragraph" w:styleId="Heading6">
-    <w:name w:val="heading 6"/>
-    <w:basedOn w:val="Normal"/>
-    <w:next w:val="BodyText"/>
-    <w:link w:val="Heading6Char"/>
-    <w:uiPriority w:val="9"/>
-    <w:semiHidden/>
-    <w:unhideWhenUsed/>
-    <w:qFormat/>
-    <w:rsid w:val="00A10FD9"/>
-    <w:rPr>
-      <w:i w:val="1"/>
-      <w:iCs w:val="1"/>
-      <w:color w:val="666666"/>
-      <w:sz w:val="22"/>
-      <w:szCs w:val="22"/>
-    </w:rPr>
-    <w:pPr>
-      <w:keepNext w:val="1"/>
-      <w:keepLines w:val="1"/>
-      <w:pageBreakBefore w:val="0"/>
-      <w:spacing w:after="80" w:before="240" w:lineRule="auto"/>
-    </w:pPr>
   </w:style>
   <w:style w:type="paragraph" w:styleId="Heading7">
     <w:name w:val="heading 7"/>
@@ -871,7 +982,7 @@
       <w:outlineLvl w:val="6"/>
     </w:pPr>
     <w:rPr>
-      <w:rFonts w:eastAsiaTheme="majorEastAsia" w:cstheme="majorBidi"/>
+      <w:rFonts w:ascii="Arial" w:hAnsi="Arial" w:cs="Arial"/>
       <w:color w:val="595959" w:themeColor="text1" w:themeTint="A6"/>
     </w:rPr>
   </w:style>
@@ -892,7 +1003,7 @@
       <w:outlineLvl w:val="7"/>
     </w:pPr>
     <w:rPr>
-      <w:rFonts w:eastAsiaTheme="majorEastAsia" w:cstheme="majorBidi"/>
+      <w:rFonts w:ascii="Arial" w:hAnsi="Arial" w:cs="Arial"/>
       <w:i/>
       <w:iCs/>
       <w:color w:val="272727" w:themeColor="text1" w:themeTint="D8"/>
@@ -915,7 +1026,7 @@
       <w:outlineLvl w:val="8"/>
     </w:pPr>
     <w:rPr>
-      <w:rFonts w:eastAsiaTheme="majorEastAsia" w:cstheme="majorBidi"/>
+      <w:rFonts w:ascii="Arial" w:hAnsi="Arial" w:cs="Arial"/>
       <w:color w:val="272727" w:themeColor="text1" w:themeTint="D8"/>
     </w:rPr>
   </w:style>
@@ -926,7 +1037,7 @@
     <w:uiPriority w:val="9"/>
     <w:rsid w:val="00A10FD9"/>
     <w:rPr>
-      <w:rFonts w:asciiTheme="majorHAnsi" w:eastAsiaTheme="majorEastAsia" w:hAnsiTheme="majorHAnsi" w:cstheme="majorBidi"/>
+      <w:rFonts w:ascii="Arial" w:hAnsi="Arial" w:cs="Arial"/>
       <w:color w:val="0F4761" w:themeColor="accent1" w:themeShade="BF"/>
       <w:sz w:val="40"/>
       <w:szCs w:val="40"/>
@@ -940,7 +1051,7 @@
     <w:semiHidden/>
     <w:rsid w:val="00A10FD9"/>
     <w:rPr>
-      <w:rFonts w:asciiTheme="majorHAnsi" w:eastAsiaTheme="majorEastAsia" w:hAnsiTheme="majorHAnsi" w:cstheme="majorBidi"/>
+      <w:rFonts w:ascii="Arial" w:hAnsi="Arial" w:cs="Arial"/>
       <w:color w:val="0F4761" w:themeColor="accent1" w:themeShade="BF"/>
       <w:sz w:val="32"/>
       <w:szCs w:val="32"/>
@@ -954,7 +1065,7 @@
     <w:semiHidden/>
     <w:rsid w:val="00A10FD9"/>
     <w:rPr>
-      <w:rFonts w:eastAsiaTheme="majorEastAsia" w:cstheme="majorBidi"/>
+      <w:rFonts w:ascii="Arial" w:hAnsi="Arial" w:cs="Arial"/>
       <w:color w:val="0F4761" w:themeColor="accent1" w:themeShade="BF"/>
       <w:sz w:val="28"/>
       <w:szCs w:val="28"/>
@@ -968,7 +1079,7 @@
     <w:semiHidden/>
     <w:rsid w:val="00A10FD9"/>
     <w:rPr>
-      <w:rFonts w:eastAsiaTheme="majorEastAsia" w:cstheme="majorBidi"/>
+      <w:rFonts w:ascii="Arial" w:hAnsi="Arial" w:cs="Arial"/>
       <w:i/>
       <w:iCs/>
       <w:color w:val="0F4761" w:themeColor="accent1" w:themeShade="BF"/>
@@ -982,7 +1093,7 @@
     <w:semiHidden/>
     <w:rsid w:val="00A10FD9"/>
     <w:rPr>
-      <w:rFonts w:eastAsiaTheme="majorEastAsia" w:cstheme="majorBidi"/>
+      <w:rFonts w:ascii="Arial" w:hAnsi="Arial" w:cs="Arial"/>
       <w:color w:val="0F4761" w:themeColor="accent1" w:themeShade="BF"/>
     </w:rPr>
   </w:style>
@@ -994,7 +1105,7 @@
     <w:semiHidden/>
     <w:rsid w:val="00A10FD9"/>
     <w:rPr>
-      <w:rFonts w:eastAsiaTheme="majorEastAsia" w:cstheme="majorBidi"/>
+      <w:rFonts w:ascii="Arial" w:hAnsi="Arial" w:cs="Arial"/>
       <w:i/>
       <w:iCs/>
       <w:color w:val="595959" w:themeColor="text1" w:themeTint="A6"/>
@@ -1008,7 +1119,7 @@
     <w:semiHidden/>
     <w:rsid w:val="00A10FD9"/>
     <w:rPr>
-      <w:rFonts w:eastAsiaTheme="majorEastAsia" w:cstheme="majorBidi"/>
+      <w:rFonts w:ascii="Arial" w:hAnsi="Arial" w:cs="Arial"/>
       <w:color w:val="595959" w:themeColor="text1" w:themeTint="A6"/>
     </w:rPr>
   </w:style>
@@ -1020,7 +1131,7 @@
     <w:semiHidden/>
     <w:rsid w:val="00A10FD9"/>
     <w:rPr>
-      <w:rFonts w:eastAsiaTheme="majorEastAsia" w:cstheme="majorBidi"/>
+      <w:rFonts w:ascii="Arial" w:hAnsi="Arial" w:cs="Arial"/>
       <w:i/>
       <w:iCs/>
       <w:color w:val="272727" w:themeColor="text1" w:themeTint="D8"/>
@@ -1034,7 +1145,7 @@
     <w:semiHidden/>
     <w:rsid w:val="00A10FD9"/>
     <w:rPr>
-      <w:rFonts w:eastAsiaTheme="majorEastAsia" w:cstheme="majorBidi"/>
+      <w:rFonts w:ascii="Arial" w:hAnsi="Arial" w:cs="Arial"/>
       <w:color w:val="272727" w:themeColor="text1" w:themeTint="D8"/>
     </w:rPr>
   </w:style>
@@ -1165,7 +1276,7 @@
     <w:name w:val="Verbatim Char"/>
     <w:basedOn w:val="BodyTextChar"/>
     <w:rPr>
-      <w:rFonts w:ascii="Consolas" w:hAnsi="Consolas"/>
+      <w:rFonts w:ascii="Consolas" w:hAnsi="Consolas" w:cs="Arial"/>
       <w:sz w:val="22"/>
     </w:rPr>
   </w:style>
@@ -1199,7 +1310,7 @@
       <w:outlineLvl w:val="9"/>
     </w:pPr>
     <w:rPr>
-      <w:rFonts w:asciiTheme="majorHAnsi" w:eastAsiaTheme="majorEastAsia" w:hAnsiTheme="majorHAnsi" w:cstheme="majorBidi"/>
+      <w:rFonts w:ascii="Arial" w:hAnsi="Arial" w:cs="Arial"/>
       <w:b w:val="0"/>
       <w:bCs w:val="0"/>
       <w:color w:val="365F91" w:themeColor="accent1" w:themeShade="BF"/>
@@ -1219,44 +1330,44 @@
         <a:sysClr val="window" lastClr="FFFFFF"/>
       </a:lt1>
       <a:dk2>
-        <a:srgbClr val="0E2841"/>
+        <a:srgbClr val="1F497D"/>
       </a:dk2>
       <a:lt2>
-        <a:srgbClr val="E8E8E8"/>
+        <a:srgbClr val="EEECE1"/>
       </a:lt2>
       <a:accent1>
-        <a:srgbClr val="156082"/>
+        <a:srgbClr val="4F81BD"/>
       </a:accent1>
       <a:accent2>
-        <a:srgbClr val="E97132"/>
+        <a:srgbClr val="C0504D"/>
       </a:accent2>
       <a:accent3>
-        <a:srgbClr val="196B24"/>
+        <a:srgbClr val="9BBB59"/>
       </a:accent3>
       <a:accent4>
-        <a:srgbClr val="0F9ED5"/>
+        <a:srgbClr val="8064A2"/>
       </a:accent4>
       <a:accent5>
-        <a:srgbClr val="A02B93"/>
+        <a:srgbClr val="4BACC6"/>
       </a:accent5>
       <a:accent6>
-        <a:srgbClr val="4EA72E"/>
+        <a:srgbClr val="F79646"/>
       </a:accent6>
       <a:hlink>
-        <a:srgbClr val="467886"/>
+        <a:srgbClr val="0000FF"/>
       </a:hlink>
       <a:folHlink>
-        <a:srgbClr val="96607D"/>
+        <a:srgbClr val="800080"/>
       </a:folHlink>
     </a:clrScheme>
     <a:fontScheme name="Office">
       <a:majorFont>
-        <a:latin typeface="Aptos Display" panose="02110004020202020204"/>
+        <a:latin typeface="Calibri"/>
         <a:ea typeface=""/>
         <a:cs typeface=""/>
-        <a:font script="Jpan" typeface="游ゴシック Light"/>
+        <a:font script="Jpan" typeface="ＭＳ ゴシック"/>
         <a:font script="Hang" typeface="맑은 고딕"/>
-        <a:font script="Hans" typeface="等线 Light"/>
+        <a:font script="Hans" typeface="宋体"/>
         <a:font script="Hant" typeface="新細明體"/>
         <a:font script="Arab" typeface="Times New Roman"/>
         <a:font script="Hebr" typeface="Times New Roman"/>
@@ -1284,31 +1395,14 @@
         <a:font script="Viet" typeface="Times New Roman"/>
         <a:font script="Uigh" typeface="Microsoft Uighur"/>
         <a:font script="Geor" typeface="Sylfaen"/>
-        <a:font script="Armn" typeface="Arial"/>
-        <a:font script="Bugi" typeface="Leelawadee UI"/>
-        <a:font script="Bopo" typeface="Microsoft JhengHei"/>
-        <a:font script="Java" typeface="Javanese Text"/>
-        <a:font script="Lisu" typeface="Segoe UI"/>
-        <a:font script="Mymr" typeface="Myanmar Text"/>
-        <a:font script="Nkoo" typeface="Ebrima"/>
-        <a:font script="Olck" typeface="Nirmala UI"/>
-        <a:font script="Osma" typeface="Ebrima"/>
-        <a:font script="Phag" typeface="Phagspa"/>
-        <a:font script="Syrn" typeface="Estrangelo Edessa"/>
-        <a:font script="Syrj" typeface="Estrangelo Edessa"/>
-        <a:font script="Syre" typeface="Estrangelo Edessa"/>
-        <a:font script="Sora" typeface="Nirmala UI"/>
-        <a:font script="Tale" typeface="Microsoft Tai Le"/>
-        <a:font script="Talu" typeface="Microsoft New Tai Lue"/>
-        <a:font script="Tfng" typeface="Ebrima"/>
       </a:majorFont>
       <a:minorFont>
-        <a:latin typeface="Aptos" panose="02110004020202020204"/>
+        <a:latin typeface="Cambria"/>
         <a:ea typeface=""/>
         <a:cs typeface=""/>
-        <a:font script="Jpan" typeface="游明朝"/>
+        <a:font script="Jpan" typeface="ＭＳ 明朝"/>
         <a:font script="Hang" typeface="맑은 고딕"/>
-        <a:font script="Hans" typeface="等线"/>
+        <a:font script="Hans" typeface="宋体"/>
         <a:font script="Hant" typeface="新細明體"/>
         <a:font script="Arab" typeface="Arial"/>
         <a:font script="Hebr" typeface="Arial"/>
@@ -1336,23 +1430,6 @@
         <a:font script="Viet" typeface="Arial"/>
         <a:font script="Uigh" typeface="Microsoft Uighur"/>
         <a:font script="Geor" typeface="Sylfaen"/>
-        <a:font script="Armn" typeface="Arial"/>
-        <a:font script="Bugi" typeface="Leelawadee UI"/>
-        <a:font script="Bopo" typeface="Microsoft JhengHei"/>
-        <a:font script="Java" typeface="Javanese Text"/>
-        <a:font script="Lisu" typeface="Segoe UI"/>
-        <a:font script="Mymr" typeface="Myanmar Text"/>
-        <a:font script="Nkoo" typeface="Ebrima"/>
-        <a:font script="Olck" typeface="Nirmala UI"/>
-        <a:font script="Osma" typeface="Ebrima"/>
-        <a:font script="Phag" typeface="Phagspa"/>
-        <a:font script="Syrn" typeface="Estrangelo Edessa"/>
-        <a:font script="Syrj" typeface="Estrangelo Edessa"/>
-        <a:font script="Syre" typeface="Estrangelo Edessa"/>
-        <a:font script="Sora" typeface="Nirmala UI"/>
-        <a:font script="Tale" typeface="Microsoft Tai Le"/>
-        <a:font script="Talu" typeface="Microsoft New Tai Lue"/>
-        <a:font script="Tfng" typeface="Ebrima"/>
       </a:minorFont>
     </a:fontScheme>
     <a:fmtScheme name="Office">
@@ -1364,141 +1441,200 @@
           <a:gsLst>
             <a:gs pos="0">
               <a:schemeClr val="phClr">
-                <a:lumMod val="110000"/>
-                <a:satMod val="105000"/>
-                <a:tint val="67000"/>
+                <a:tint val="50000"/>
+                <a:satMod val="300000"/>
               </a:schemeClr>
             </a:gs>
-            <a:gs pos="50000">
+            <a:gs pos="35000">
               <a:schemeClr val="phClr">
-                <a:lumMod val="105000"/>
-                <a:satMod val="103000"/>
-                <a:tint val="73000"/>
+                <a:tint val="37000"/>
+                <a:satMod val="300000"/>
               </a:schemeClr>
             </a:gs>
             <a:gs pos="100000">
               <a:schemeClr val="phClr">
-                <a:lumMod val="105000"/>
-                <a:satMod val="109000"/>
-                <a:tint val="81000"/>
+                <a:tint val="15000"/>
+                <a:satMod val="350000"/>
               </a:schemeClr>
             </a:gs>
           </a:gsLst>
-          <a:lin ang="5400000" scaled="0"/>
+          <a:lin ang="16200000" scaled="1"/>
         </a:gradFill>
         <a:gradFill rotWithShape="1">
           <a:gsLst>
             <a:gs pos="0">
               <a:schemeClr val="phClr">
-                <a:satMod val="103000"/>
-                <a:lumMod val="102000"/>
-                <a:tint val="94000"/>
-              </a:schemeClr>
-            </a:gs>
-            <a:gs pos="50000">
-              <a:schemeClr val="phClr">
-                <a:satMod val="110000"/>
-                <a:lumMod val="100000"/>
+                <a:tint val="100000"/>
                 <a:shade val="100000"/>
+                <a:satMod val="130000"/>
               </a:schemeClr>
             </a:gs>
             <a:gs pos="100000">
               <a:schemeClr val="phClr">
-                <a:lumMod val="99000"/>
-                <a:satMod val="120000"/>
-                <a:shade val="78000"/>
+                <a:tint val="50000"/>
+                <a:shade val="100000"/>
+                <a:satMod val="350000"/>
               </a:schemeClr>
             </a:gs>
           </a:gsLst>
-          <a:lin ang="5400000" scaled="0"/>
+          <a:lin ang="16200000" scaled="0"/>
         </a:gradFill>
       </a:fillStyleLst>
       <a:lnStyleLst>
-        <a:ln w="6350" cap="flat" cmpd="sng" algn="ctr">
+        <a:ln w="9525" cap="flat" cmpd="sng" algn="ctr">
+          <a:solidFill>
+            <a:schemeClr val="phClr">
+              <a:shade val="95000"/>
+              <a:satMod val="105000"/>
+            </a:schemeClr>
+          </a:solidFill>
+          <a:prstDash val="solid"/>
+        </a:ln>
+        <a:ln w="25400" cap="flat" cmpd="sng" algn="ctr">
           <a:solidFill>
             <a:schemeClr val="phClr"/>
           </a:solidFill>
           <a:prstDash val="solid"/>
-          <a:miter lim="800000"/>
         </a:ln>
-        <a:ln w="12700" cap="flat" cmpd="sng" algn="ctr">
+        <a:ln w="38100" cap="flat" cmpd="sng" algn="ctr">
           <a:solidFill>
             <a:schemeClr val="phClr"/>
           </a:solidFill>
           <a:prstDash val="solid"/>
-          <a:miter lim="800000"/>
-        </a:ln>
-        <a:ln w="19050" cap="flat" cmpd="sng" algn="ctr">
-          <a:solidFill>
-            <a:schemeClr val="phClr"/>
-          </a:solidFill>
-          <a:prstDash val="solid"/>
-          <a:miter lim="800000"/>
         </a:ln>
       </a:lnStyleLst>
       <a:effectStyleLst>
         <a:effectStyle>
-          <a:effectLst/>
-        </a:effectStyle>
-        <a:effectStyle>
-          <a:effectLst/>
+          <a:effectLst>
+            <a:outerShdw blurRad="40000" dist="20000" dir="5400000" rotWithShape="0">
+              <a:srgbClr val="000000">
+                <a:alpha val="38000"/>
+              </a:srgbClr>
+            </a:outerShdw>
+          </a:effectLst>
         </a:effectStyle>
         <a:effectStyle>
           <a:effectLst>
-            <a:outerShdw blurRad="57150" dist="19050" dir="5400000" algn="ctr" rotWithShape="0">
+            <a:outerShdw blurRad="40000" dist="23000" dir="5400000" rotWithShape="0">
               <a:srgbClr val="000000">
-                <a:alpha val="63000"/>
+                <a:alpha val="35000"/>
               </a:srgbClr>
             </a:outerShdw>
           </a:effectLst>
+        </a:effectStyle>
+        <a:effectStyle>
+          <a:effectLst>
+            <a:outerShdw blurRad="40000" dist="23000" dir="5400000" rotWithShape="0">
+              <a:srgbClr val="000000">
+                <a:alpha val="35000"/>
+              </a:srgbClr>
+            </a:outerShdw>
+          </a:effectLst>
+          <a:scene3d>
+            <a:camera prst="orthographicFront">
+              <a:rot lat="0" lon="0" rev="0"/>
+            </a:camera>
+            <a:lightRig rig="threePt" dir="t">
+              <a:rot lat="0" lon="0" rev="1200000"/>
+            </a:lightRig>
+          </a:scene3d>
+          <a:sp3d>
+            <a:bevelT w="63500" h="25400"/>
+          </a:sp3d>
         </a:effectStyle>
       </a:effectStyleLst>
       <a:bgFillStyleLst>
         <a:solidFill>
           <a:schemeClr val="phClr"/>
         </a:solidFill>
-        <a:solidFill>
-          <a:schemeClr val="phClr">
-            <a:tint val="95000"/>
-            <a:satMod val="170000"/>
-          </a:schemeClr>
-        </a:solidFill>
         <a:gradFill rotWithShape="1">
           <a:gsLst>
             <a:gs pos="0">
               <a:schemeClr val="phClr">
-                <a:tint val="93000"/>
-                <a:satMod val="150000"/>
-                <a:shade val="98000"/>
-                <a:lumMod val="102000"/>
+                <a:tint val="40000"/>
+                <a:satMod val="350000"/>
               </a:schemeClr>
             </a:gs>
-            <a:gs pos="50000">
+            <a:gs pos="40000">
               <a:schemeClr val="phClr">
-                <a:tint val="98000"/>
-                <a:satMod val="130000"/>
-                <a:shade val="90000"/>
-                <a:lumMod val="103000"/>
+                <a:tint val="45000"/>
+                <a:shade val="99000"/>
+                <a:satMod val="350000"/>
               </a:schemeClr>
             </a:gs>
             <a:gs pos="100000">
               <a:schemeClr val="phClr">
-                <a:shade val="63000"/>
-                <a:satMod val="120000"/>
+                <a:shade val="20000"/>
+                <a:satMod val="255000"/>
               </a:schemeClr>
             </a:gs>
           </a:gsLst>
-          <a:lin ang="5400000" scaled="0"/>
+          <a:path path="circle">
+            <a:fillToRect l="50000" t="-80000" r="50000" b="180000"/>
+          </a:path>
+        </a:gradFill>
+        <a:gradFill rotWithShape="1">
+          <a:gsLst>
+            <a:gs pos="0">
+              <a:schemeClr val="phClr">
+                <a:tint val="80000"/>
+                <a:satMod val="300000"/>
+              </a:schemeClr>
+            </a:gs>
+            <a:gs pos="100000">
+              <a:schemeClr val="phClr">
+                <a:shade val="30000"/>
+                <a:satMod val="200000"/>
+              </a:schemeClr>
+            </a:gs>
+          </a:gsLst>
+          <a:path path="circle">
+            <a:fillToRect l="50000" t="50000" r="50000" b="50000"/>
+          </a:path>
         </a:gradFill>
       </a:bgFillStyleLst>
     </a:fmtScheme>
   </a:themeElements>
-  <a:objectDefaults/>
+  <a:objectDefaults>
+    <a:spDef>
+      <a:spPr/>
+      <a:bodyPr/>
+      <a:lstStyle/>
+      <a:style>
+        <a:lnRef idx="1">
+          <a:schemeClr val="accent1"/>
+        </a:lnRef>
+        <a:fillRef idx="3">
+          <a:schemeClr val="accent1"/>
+        </a:fillRef>
+        <a:effectRef idx="2">
+          <a:schemeClr val="accent1"/>
+        </a:effectRef>
+        <a:fontRef idx="minor">
+          <a:schemeClr val="lt1"/>
+        </a:fontRef>
+      </a:style>
+    </a:spDef>
+    <a:lnDef>
+      <a:spPr/>
+      <a:bodyPr/>
+      <a:lstStyle/>
+      <a:style>
+        <a:lnRef idx="2">
+          <a:schemeClr val="accent1"/>
+        </a:lnRef>
+        <a:fillRef idx="0">
+          <a:schemeClr val="accent1"/>
+        </a:fillRef>
+        <a:effectRef idx="1">
+          <a:schemeClr val="accent1"/>
+        </a:effectRef>
+        <a:fontRef idx="minor">
+          <a:schemeClr val="tx1"/>
+        </a:fontRef>
+      </a:style>
+    </a:lnDef>
+  </a:objectDefaults>
   <a:extraClrSchemeLst/>
-  <a:extLst>
-    <a:ext uri="{05A4C25C-085E-4340-85A3-A5531E510DB2}">
-      <thm15:themeFamily xmlns:thm15="http://schemas.microsoft.com/office/thememl/2012/main" name="Office Theme" id="{2E142A2C-CD16-42D6-873A-C26D2A0506FA}" vid="{1BDDFF52-6CD6-40A5-AB3C-68EB2F1E4D0A}"/>
-    </a:ext>
-  </a:extLst>
 </a:theme>
 </file>
</xml_diff>